<commit_message>
CR-MARKETING Sub-Domain Overview v1.1 → v1.2: Add Segment to deferred Entity PRDs
Carry-forward update from CR-MARKETING-CONTACTS v1.0.

Changes:
- Version 1.1 → 1.2, Last Updated 04-09-26 23:42
- Section 4.1 Entity Summary table: Segment row added (Custom Base,
  Deferred, owned by CR-MARKETING-CONTACTS, two types Dynamic/Static)
- Depends On: Entity Inventory reference updated v1.3 → v1.4
- Deferred Phase 2b Entity PRDs now total 4: Marketing Campaign,
  Campaign Group, Campaign Engagement (surfaced by SDO v1.0),
  and Segment (surfaced by CR-MARKETING-CONTACTS v1.0)
- Historical references to 'three' entities in Section 6 and Section 8
  left unchanged — they accurately describe what the SDO surfaced;
  Segment was surfaced by a different document
</commit_message>
<xml_diff>
--- a/PRDs/CR/MARKETING/CBM-SubDomain-Overview-Marketing.docx
+++ b/PRDs/CR/MARKETING/CBM-SubDomain-Overview-Marketing.docx
@@ -114,7 +114,7 @@
                 <w:sz w:val="20"/>
                 <w:szCs w:val="20"/>
               </w:rPr>
-              <w:t xml:space="preserve">1.1</w:t>
+              <w:t xml:space="preserve">1.2</w:t>
             </w:r>
           </w:p>
         </w:tc>
@@ -244,7 +244,7 @@
                 <w:sz w:val="20"/>
                 <w:szCs w:val="20"/>
               </w:rPr>
-              <w:t xml:space="preserve">04-09-26 10:05</w:t>
+              <w:t xml:space="preserve">04-09-26 23:42</w:t>
             </w:r>
           </w:p>
         </w:tc>
@@ -439,7 +439,7 @@
                 <w:sz w:val="20"/>
                 <w:szCs w:val="20"/>
               </w:rPr>
-              <w:t xml:space="preserve">CBM-Domain-Overview-ClientRecruiting.docx v1.0, CBM-SubDomain-Overview-Partner.docx v1.1, CBM-Master-PRD.docx v2.5, CBM-Entity-Inventory.docx v1.3, Contact-Entity-PRD.docx v1.3, Account-Entity-PRD.docx v1.3</w:t>
+              <w:t xml:space="preserve">CBM-Domain-Overview-ClientRecruiting.docx v1.0, CBM-SubDomain-Overview-Partner.docx v1.1, CBM-Master-PRD.docx v2.5, CBM-Entity-Inventory.docx v1.4, Contact-Entity-PRD.docx v1.3, Account-Entity-PRD.docx v1.3</w:t>
             </w:r>
           </w:p>
         </w:tc>
@@ -2732,6 +2732,132 @@
                 <w:szCs w:val="20"/>
               </w:rPr>
               <w:t xml:space="preserve">Per-recipient engagement record linking a Contact to a Campaign with send/open/click/bounce tracking. Owned exclusively by CR-MARKETING-CAMPAIGNS. Entity PRD depends on CR-MARKETING-CAMPAIGNS process document.</w:t>
+            </w:r>
+          </w:p>
+        </w:tc>
+      </w:tr>
+      <w:tr>
+        <w:tc>
+          <w:tcPr>
+            <w:tcW w:type="dxa" w:w="2000"/>
+            <w:tcBorders>
+              <w:top w:val="single" w:color="AAAAAA" w:sz="1"/>
+              <w:left w:val="single" w:color="AAAAAA" w:sz="1"/>
+              <w:bottom w:val="single" w:color="AAAAAA" w:sz="1"/>
+              <w:right w:val="single" w:color="AAAAAA" w:sz="1"/>
+            </w:tcBorders>
+            <w:tcMar>
+              <w:top w:type="dxa" w:w="60"/>
+              <w:left w:type="dxa" w:w="100"/>
+              <w:bottom w:type="dxa" w:w="60"/>
+              <w:right w:type="dxa" w:w="100"/>
+            </w:tcMar>
+          </w:tcPr>
+          <w:p>
+            <w:r>
+              <w:rPr>
+                <w:rFonts w:ascii="Arial" w:cs="Arial" w:eastAsia="Arial" w:hAnsi="Arial"/>
+                <w:b w:val="false"/>
+                <w:bCs w:val="false"/>
+                <w:i w:val="false"/>
+                <w:iCs w:val="false"/>
+                <w:sz w:val="20"/>
+                <w:szCs w:val="20"/>
+              </w:rPr>
+              <w:t xml:space="preserve">Segment</w:t>
+            </w:r>
+          </w:p>
+        </w:tc>
+        <w:tc>
+          <w:tcPr>
+            <w:tcW w:type="dxa" w:w="1500"/>
+            <w:tcBorders>
+              <w:top w:val="single" w:color="AAAAAA" w:sz="1"/>
+              <w:left w:val="single" w:color="AAAAAA" w:sz="1"/>
+              <w:bottom w:val="single" w:color="AAAAAA" w:sz="1"/>
+              <w:right w:val="single" w:color="AAAAAA" w:sz="1"/>
+            </w:tcBorders>
+            <w:tcMar>
+              <w:top w:type="dxa" w:w="60"/>
+              <w:left w:type="dxa" w:w="100"/>
+              <w:bottom w:type="dxa" w:w="60"/>
+              <w:right w:type="dxa" w:w="100"/>
+            </w:tcMar>
+          </w:tcPr>
+          <w:p>
+            <w:r>
+              <w:rPr>
+                <w:rFonts w:ascii="Arial" w:cs="Arial" w:eastAsia="Arial" w:hAnsi="Arial"/>
+                <w:b w:val="false"/>
+                <w:bCs w:val="false"/>
+                <w:i w:val="false"/>
+                <w:iCs w:val="false"/>
+                <w:sz w:val="20"/>
+                <w:szCs w:val="20"/>
+              </w:rPr>
+              <w:t xml:space="preserve">Custom Base</w:t>
+            </w:r>
+          </w:p>
+        </w:tc>
+        <w:tc>
+          <w:tcPr>
+            <w:tcW w:type="dxa" w:w="1300"/>
+            <w:tcBorders>
+              <w:top w:val="single" w:color="AAAAAA" w:sz="1"/>
+              <w:left w:val="single" w:color="AAAAAA" w:sz="1"/>
+              <w:bottom w:val="single" w:color="AAAAAA" w:sz="1"/>
+              <w:right w:val="single" w:color="AAAAAA" w:sz="1"/>
+            </w:tcBorders>
+            <w:tcMar>
+              <w:top w:type="dxa" w:w="60"/>
+              <w:left w:type="dxa" w:w="100"/>
+              <w:bottom w:type="dxa" w:w="60"/>
+              <w:right w:type="dxa" w:w="100"/>
+            </w:tcMar>
+          </w:tcPr>
+          <w:p>
+            <w:r>
+              <w:rPr>
+                <w:rFonts w:ascii="Arial" w:cs="Arial" w:eastAsia="Arial" w:hAnsi="Arial"/>
+                <w:b w:val="false"/>
+                <w:bCs w:val="false"/>
+                <w:i w:val="false"/>
+                <w:iCs w:val="false"/>
+                <w:sz w:val="20"/>
+                <w:szCs w:val="20"/>
+              </w:rPr>
+              <w:t xml:space="preserve">Deferred</w:t>
+            </w:r>
+          </w:p>
+        </w:tc>
+        <w:tc>
+          <w:tcPr>
+            <w:tcW w:type="dxa" w:w="4560"/>
+            <w:tcBorders>
+              <w:top w:val="single" w:color="AAAAAA" w:sz="1"/>
+              <w:left w:val="single" w:color="AAAAAA" w:sz="1"/>
+              <w:bottom w:val="single" w:color="AAAAAA" w:sz="1"/>
+              <w:right w:val="single" w:color="AAAAAA" w:sz="1"/>
+            </w:tcBorders>
+            <w:tcMar>
+              <w:top w:type="dxa" w:w="60"/>
+              <w:left w:type="dxa" w:w="100"/>
+              <w:bottom w:type="dxa" w:w="60"/>
+              <w:right w:type="dxa" w:w="100"/>
+            </w:tcMar>
+          </w:tcPr>
+          <w:p>
+            <w:r>
+              <w:rPr>
+                <w:rFonts w:ascii="Arial" w:cs="Arial" w:eastAsia="Arial" w:hAnsi="Arial"/>
+                <w:b w:val="false"/>
+                <w:bCs w:val="false"/>
+                <w:i w:val="false"/>
+                <w:iCs w:val="false"/>
+                <w:sz w:val="20"/>
+                <w:szCs w:val="20"/>
+              </w:rPr>
+              <w:t xml:space="preserve">Contact list management entity with two types (Dynamic and Static via immutable segmentType enum). Used by CR-MARKETING-CONTACTS for audience segmentation and by CR-MARKETING-CAMPAIGNS as campaign send lists. Owned by CR-MARKETING-CONTACTS. Entity PRD deferred to Phase 2b; surfaced by CR-MARKETING-CONTACTS v1.0.</w:t>
             </w:r>
           </w:p>
         </w:tc>

</xml_diff>